<commit_message>
reglage du probleme de lenteur en changeanle localhost par une adresse ip
</commit_message>
<xml_diff>
--- a/documentation/RAPPORT DE PROJET.docx
+++ b/documentation/RAPPORT DE PROJET.docx
@@ -4,6 +4,12 @@
   <w:body>
     <w:sdt>
       <w:sdtPr>
+        <w:rPr>
+          <w:rFonts w:eastAsiaTheme="minorHAnsi"/>
+          <w:kern w:val="2"/>
+          <w:lang w:eastAsia="en-US"/>
+          <w14:ligatures w14:val="standardContextual"/>
+        </w:rPr>
         <w:id w:val="1961380126"/>
         <w:docPartObj>
           <w:docPartGallery w:val="Cover Pages"/>
@@ -12,12 +18,8 @@
       </w:sdtPr>
       <w:sdtEndPr>
         <w:rPr>
-          <w:rFonts w:eastAsiaTheme="minorHAnsi"/>
           <w:b/>
           <w:bCs/>
-          <w:kern w:val="2"/>
-          <w:lang w:eastAsia="en-US"/>
-          <w14:ligatures w14:val="standardContextual"/>
         </w:rPr>
       </w:sdtEndPr>
       <w:sdtContent>
@@ -7218,25 +7220,26 @@
         <w:br w:type="page"/>
       </w:r>
     </w:p>
+    <w:p/>
+    <w:p/>
     <w:p>
       <w:r>
         <w:rPr>
           <w:noProof/>
         </w:rPr>
-        <w:lastRenderedPageBreak/>
         <w:drawing>
-          <wp:anchor distT="0" distB="0" distL="114300" distR="114300" simplePos="0" relativeHeight="251658240" behindDoc="0" locked="0" layoutInCell="1" allowOverlap="1" wp14:anchorId="7E50E977" wp14:editId="0DE3ECF9">
+          <wp:anchor distT="0" distB="0" distL="114300" distR="114300" simplePos="0" relativeHeight="251663360" behindDoc="1" locked="0" layoutInCell="1" allowOverlap="1" wp14:anchorId="01C6766C" wp14:editId="006ADD8B">
             <wp:simplePos x="0" y="0"/>
             <wp:positionH relativeFrom="column">
-              <wp:posOffset>-655955</wp:posOffset>
+              <wp:posOffset>-815975</wp:posOffset>
             </wp:positionH>
             <wp:positionV relativeFrom="paragraph">
-              <wp:posOffset>-404495</wp:posOffset>
+              <wp:posOffset>342265</wp:posOffset>
             </wp:positionV>
-            <wp:extent cx="7040880" cy="5875020"/>
-            <wp:effectExtent l="0" t="0" r="7620" b="0"/>
+            <wp:extent cx="7345680" cy="5897880"/>
+            <wp:effectExtent l="0" t="0" r="7620" b="7620"/>
             <wp:wrapNone/>
-            <wp:docPr id="1" name="Image 1"/>
+            <wp:docPr id="37" name="Image 37"/>
             <wp:cNvGraphicFramePr>
               <a:graphicFrameLocks xmlns:a="http://schemas.openxmlformats.org/drawingml/2006/main" noChangeAspect="1"/>
             </wp:cNvGraphicFramePr>
@@ -7244,7 +7247,7 @@
               <a:graphicData uri="http://schemas.openxmlformats.org/drawingml/2006/picture">
                 <pic:pic xmlns:pic="http://schemas.openxmlformats.org/drawingml/2006/picture">
                   <pic:nvPicPr>
-                    <pic:cNvPr id="0" name="Picture 1"/>
+                    <pic:cNvPr id="0" name="Picture 10"/>
                     <pic:cNvPicPr>
                       <a:picLocks noChangeAspect="1" noChangeArrowheads="1"/>
                     </pic:cNvPicPr>
@@ -7256,10 +7259,7 @@
                           <a14:imgProps xmlns:a14="http://schemas.microsoft.com/office/drawing/2010/main">
                             <a14:imgLayer r:embed="rId6">
                               <a14:imgEffect>
-                                <a14:sharpenSoften amount="25000"/>
-                              </a14:imgEffect>
-                              <a14:imgEffect>
-                                <a14:colorTemperature colorTemp="5900"/>
+                                <a14:brightnessContrast contrast="40000"/>
                               </a14:imgEffect>
                             </a14:imgLayer>
                           </a14:imgProps>
@@ -7277,7 +7277,7 @@
                   <pic:spPr bwMode="auto">
                     <a:xfrm>
                       <a:off x="0" y="0"/>
-                      <a:ext cx="7040880" cy="5875020"/>
+                      <a:ext cx="7345680" cy="5897880"/>
                     </a:xfrm>
                     <a:prstGeom prst="rect">
                       <a:avLst/>
@@ -7299,8 +7299,6 @@
           </wp:anchor>
         </w:drawing>
       </w:r>
-    </w:p>
-    <w:p>
       <w:r>
         <w:br w:type="page"/>
       </w:r>

</xml_diff>